<commit_message>
Session 2 rework: 24 activities, no handouts, clean slides
- 5 DISCOVER / 6 ACTIVITY / 4 KEY IDEAS / 5 DISCUSSION / 4 CLOSING
- Removed sealed envelope + printed trade-off cards
- Phone notes / Mentimeter / Padlet / whiteboard only
- Facilitator notes stripped from slides (moved to DOCX + collapsible web section)

Co-Authored-By: Claude Opus 4.6 <noreply@anthropic.com>
</commit_message>
<xml_diff>
--- a/assets/downloads/Session-2-Your-Values-Under-Pressure-Facilitator-Guide.docx
+++ b/assets/downloads/Session-2-Your-Values-Under-Pressure-Facilitator-Guide.docx
@@ -3,17 +3,39 @@
 <w:document xmlns:wpc="http://schemas.microsoft.com/office/word/2010/wordprocessingCanvas" xmlns:mo="http://schemas.microsoft.com/office/mac/office/2008/main" xmlns:mc="http://schemas.openxmlformats.org/markup-compatibility/2006" xmlns:mv="urn:schemas-microsoft-com:mac:vml" xmlns:o="urn:schemas-microsoft-com:office:office" xmlns:r="http://schemas.openxmlformats.org/officeDocument/2006/relationships" xmlns:m="http://schemas.openxmlformats.org/officeDocument/2006/math" xmlns:v="urn:schemas-microsoft-com:vml" xmlns:wp14="http://schemas.microsoft.com/office/word/2010/wordprocessingDrawing" xmlns:wp="http://schemas.openxmlformats.org/drawingml/2006/wordprocessingDrawing" xmlns:w10="urn:schemas-microsoft-com:office:word" xmlns:w="http://schemas.openxmlformats.org/wordprocessingml/2006/main" xmlns:w14="http://schemas.microsoft.com/office/word/2010/wordml" xmlns:wpg="http://schemas.microsoft.com/office/word/2010/wordprocessingGroup" xmlns:wpi="http://schemas.microsoft.com/office/word/2010/wordprocessingInk" xmlns:wne="http://schemas.microsoft.com/office/word/2006/wordml" xmlns:wps="http://schemas.microsoft.com/office/word/2010/wordprocessingShape" mc:Ignorable="w14 wp14">
   <w:body>
     <w:p>
-      <w:pPr>
-        <w:jc w:val="right"/>
-      </w:pPr>
       <w:r>
-        <w:rPr>
-          <w:rFonts w:ascii="Calibri" w:hAnsi="Calibri"/>
-          <w:b w:val="0"/>
-          <w:color w:val="888888"/>
-          <w:sz w:val="20"/>
-        </w:rPr>
-        <w:t>Robocode x LIA  |  Digital Youth Work CPD Programme</w:t>
+        <w:drawing>
+          <wp:inline xmlns:a="http://schemas.openxmlformats.org/drawingml/2006/main" xmlns:pic="http://schemas.openxmlformats.org/drawingml/2006/picture">
+            <wp:extent cx="1645920" cy="382445"/>
+            <wp:docPr id="1" name="Picture 1"/>
+            <wp:cNvGraphicFramePr>
+              <a:graphicFrameLocks noChangeAspect="1"/>
+            </wp:cNvGraphicFramePr>
+            <a:graphic>
+              <a:graphicData uri="http://schemas.openxmlformats.org/drawingml/2006/picture">
+                <pic:pic>
+                  <pic:nvPicPr>
+                    <pic:cNvPr id="0" name="logo.png"/>
+                    <pic:cNvPicPr/>
+                  </pic:nvPicPr>
+                  <pic:blipFill>
+                    <a:blip r:embed="rId9"/>
+                    <a:stretch>
+                      <a:fillRect/>
+                    </a:stretch>
+                  </pic:blipFill>
+                  <pic:spPr>
+                    <a:xfrm>
+                      <a:off x="0" y="0"/>
+                      <a:ext cx="1645920" cy="382445"/>
+                    </a:xfrm>
+                    <a:prstGeom prst="rect"/>
+                  </pic:spPr>
+                </pic:pic>
+              </a:graphicData>
+            </a:graphic>
+          </wp:inline>
+        </w:drawing>
       </w:r>
     </w:p>
     <w:p>
@@ -21,18 +43,20 @@
         <w:pStyle w:val="Title"/>
       </w:pPr>
       <w:r>
+        <w:rPr>
+          <w:color w:val="0D0D1A"/>
+        </w:rPr>
         <w:t>Session 2: Your Values Under Pressure</w:t>
       </w:r>
     </w:p>
     <w:p>
       <w:r>
         <w:rPr>
-          <w:rFonts w:ascii="Calibri" w:hAnsi="Calibri"/>
           <w:b/>
-          <w:color w:val="4EA8E6"/>
-          <w:sz w:val="28"/>
+          <w:color w:val="7B61FF"/>
+          <w:sz w:val="22"/>
         </w:rPr>
-        <w:t>Facilitator Guide</w:t>
+        <w:t>Facilitator Guide  ·  Digital Youth Work CPD  ·  Robocode × LIA</w:t>
       </w:r>
     </w:p>
     <w:p/>
@@ -42,7 +66,7 @@
       </w:pPr>
       <w:r>
         <w:rPr>
-          <w:color w:val="1A1A1A"/>
+          <w:color w:val="E91E8C"/>
         </w:rPr>
         <w:t>Learning Objectives (LIA Template)</w:t>
       </w:r>
@@ -50,8 +74,8 @@
     <w:p>
       <w:r>
         <w:rPr>
-          <w:rFonts w:ascii="Calibri" w:hAnsi="Calibri"/>
           <w:b/>
+          <w:color w:val="00A6AD"/>
           <w:sz w:val="24"/>
         </w:rPr>
         <w:t>Aim</w:t>
@@ -59,20 +83,14 @@
     </w:p>
     <w:p>
       <w:r>
-        <w:rPr>
-          <w:rFonts w:ascii="Calibri" w:hAnsi="Calibri"/>
-          <w:b w:val="0"/>
-          <w:sz w:val="22"/>
-        </w:rPr>
         <w:t>Practitioners test whether their stated values survive contact with real digital design and live pressure.</w:t>
       </w:r>
     </w:p>
-    <w:p/>
     <w:p>
       <w:r>
         <w:rPr>
-          <w:rFonts w:ascii="Calibri" w:hAnsi="Calibri"/>
           <w:b/>
+          <w:color w:val="00A6AD"/>
           <w:sz w:val="24"/>
         </w:rPr>
         <w:t>Objectives</w:t>
@@ -110,12 +128,11 @@
         <w:t>Reflect on the gap between intention and observable behaviour</w:t>
       </w:r>
     </w:p>
-    <w:p/>
     <w:p>
       <w:r>
         <w:rPr>
-          <w:rFonts w:ascii="Calibri" w:hAnsi="Calibri"/>
           <w:b/>
+          <w:color w:val="00A6AD"/>
           <w:sz w:val="24"/>
         </w:rPr>
         <w:t>Outcomes</w:t>
@@ -164,7 +181,7 @@
       </w:pPr>
       <w:r>
         <w:rPr>
-          <w:color w:val="1A1A1A"/>
+          <w:color w:val="E91E8C"/>
         </w:rPr>
         <w:t>Session Plan</w:t>
       </w:r>
@@ -239,7 +256,7 @@
           </w:tcPr>
           <w:p>
             <w:r>
-              <w:t>Values Brainstorm, Rank Your Top 3</w:t>
+              <w:t>5 activities — pick what fits your group</w:t>
             </w:r>
           </w:p>
         </w:tc>
@@ -271,7 +288,7 @@
           </w:tcPr>
           <w:p>
             <w:r>
-              <w:t>Seal Your Value, Build It, Run It + Observe, Envelope Reveal</w:t>
+              <w:t>6 activities — pick what fits your group</w:t>
             </w:r>
           </w:p>
         </w:tc>
@@ -303,7 +320,7 @@
           </w:tcPr>
           <w:p>
             <w:r>
-              <w:t>Pressure Scenarios</w:t>
+              <w:t>4 activities — pick what fits your group</w:t>
             </w:r>
           </w:p>
         </w:tc>
@@ -335,7 +352,7 @@
           </w:tcPr>
           <w:p>
             <w:r>
-              <w:t>Value Trade-Off Cards, Redesign Under Constraint, Fishbowl Discussion</w:t>
+              <w:t>5 activities — pick what fits your group</w:t>
             </w:r>
           </w:p>
         </w:tc>
@@ -367,7 +384,7 @@
           </w:tcPr>
           <w:p>
             <w:r>
-              <w:t>Principle Statement, Exit Ticket</w:t>
+              <w:t>4 activities — pick what fits your group</w:t>
             </w:r>
           </w:p>
         </w:tc>
@@ -375,108 +392,12 @@
     </w:tbl>
     <w:p/>
     <w:p>
-      <w:pPr>
-        <w:pStyle w:val="Heading2"/>
-      </w:pPr>
       <w:r>
         <w:rPr>
-          <w:color w:val="1A1A1A"/>
+          <w:i/>
+          <w:color w:val="7B7B96"/>
         </w:rPr>
-        <w:t>1. DISCOVER (0 – 15 min)</w:t>
-      </w:r>
-    </w:p>
-    <w:p>
-      <w:r>
-        <w:rPr>
-          <w:rFonts w:ascii="Calibri" w:hAnsi="Calibri"/>
-          <w:b/>
-          <w:sz w:val="22"/>
-        </w:rPr>
-        <w:t>Opening Question:</w:t>
-      </w:r>
-    </w:p>
-    <w:p>
-      <w:r>
-        <w:rPr>
-          <w:rFonts w:ascii="Calibri" w:hAnsi="Calibri"/>
-          <w:b/>
-          <w:color w:val="4EA8E6"/>
-          <w:sz w:val="26"/>
-        </w:rPr>
-        <w:t>"What do you actually believe about youth work — and does it hold up when things go wrong?"</w:t>
-      </w:r>
-    </w:p>
-    <w:p>
-      <w:r>
-        <w:rPr>
-          <w:rFonts w:ascii="Calibri" w:hAnsi="Calibri"/>
-          <w:b/>
-          <w:sz w:val="22"/>
-        </w:rPr>
-        <w:t>What this means:</w:t>
-      </w:r>
-    </w:p>
-    <w:p>
-      <w:r>
-        <w:rPr>
-          <w:rFonts w:ascii="Calibri" w:hAnsi="Calibri"/>
-          <w:b w:val="0"/>
-          <w:sz w:val="22"/>
-        </w:rPr>
-        <w:t>Everyone has values they say they hold. This session tests whether those values show up in what you actually build and how you react when things don't go to plan.</w:t>
-      </w:r>
-    </w:p>
-    <w:p/>
-    <w:p>
-      <w:r>
-        <w:rPr>
-          <w:rFonts w:ascii="Calibri" w:hAnsi="Calibri"/>
-          <w:b/>
-          <w:sz w:val="24"/>
-        </w:rPr>
-        <w:t>▶  Values Brainstorm  (5 min)</w:t>
-      </w:r>
-    </w:p>
-    <w:p>
-      <w:r>
-        <w:rPr>
-          <w:rFonts w:ascii="Calibri" w:hAnsi="Calibri"/>
-          <w:b w:val="0"/>
-          <w:color w:val="4EA8E6"/>
-          <w:sz w:val="20"/>
-        </w:rPr>
-        <w:t>Tool: Mentimeter</w:t>
-      </w:r>
-    </w:p>
-    <w:p>
-      <w:r>
-        <w:rPr>
-          <w:rFonts w:ascii="Calibri" w:hAnsi="Calibri"/>
-          <w:b w:val="0"/>
-          <w:sz w:val="22"/>
-        </w:rPr>
-        <w:t>Submit your top 3 youth work values to a word cloud. What comes up most? What's surprising?</w:t>
-      </w:r>
-    </w:p>
-    <w:p/>
-    <w:p>
-      <w:r>
-        <w:rPr>
-          <w:rFonts w:ascii="Calibri" w:hAnsi="Calibri"/>
-          <w:b/>
-          <w:sz w:val="24"/>
-        </w:rPr>
-        <w:t>▶  Rank Your Top 3  (5 min)</w:t>
-      </w:r>
-    </w:p>
-    <w:p>
-      <w:r>
-        <w:rPr>
-          <w:rFonts w:ascii="Calibri" w:hAnsi="Calibri"/>
-          <w:b w:val="0"/>
-          <w:sz w:val="22"/>
-        </w:rPr>
-        <w:t>From the word cloud, pick YOUR top 3 values. Write them on a card in order. Keep the card — you'll need it later.</w:t>
+        <w:t>Note: Each block has more activities than you can fit. Pick what matches your group. Running short on time is better than rushing.</w:t>
       </w:r>
     </w:p>
     <w:p/>
@@ -486,103 +407,165 @@
       </w:pPr>
       <w:r>
         <w:rPr>
-          <w:color w:val="1A1A1A"/>
+          <w:color w:val="00A6AD"/>
         </w:rPr>
-        <w:t>2. ACTIVITY (15 – 75 min)</w:t>
+        <w:t>1. DISCOVER (0 – 15 min)</w:t>
       </w:r>
     </w:p>
     <w:p>
       <w:r>
         <w:rPr>
-          <w:rFonts w:ascii="Calibri" w:hAnsi="Calibri"/>
           <w:b/>
-          <w:sz w:val="24"/>
         </w:rPr>
-        <w:t>▶  Seal Your Value  (5 min)</w:t>
+        <w:t>Opening Question:</w:t>
       </w:r>
     </w:p>
     <w:p>
       <w:r>
         <w:rPr>
-          <w:rFonts w:ascii="Calibri" w:hAnsi="Calibri"/>
-          <w:b w:val="0"/>
-          <w:sz w:val="22"/>
+          <w:i/>
+          <w:color w:val="00A6AD"/>
+          <w:sz w:val="26"/>
         </w:rPr>
-        <w:t>Pick ONE value from your card. Write it on a slip of paper. Seal it in an envelope. This is the value you're going to deliberately embed in a digital activity. Don't tell anyone what it is.</w:t>
+        <w:t>"What do you actually believe about youth work — and does it hold up when things go wrong?"</w:t>
+      </w:r>
+    </w:p>
+    <w:p>
+      <w:r>
+        <w:rPr>
+          <w:b/>
+        </w:rPr>
+        <w:t xml:space="preserve">What this means: </w:t>
+      </w:r>
+      <w:r>
+        <w:t>Everyone has values they say they hold. This session tests whether those values show up in what you actually build and how you react when things don't go to plan.</w:t>
       </w:r>
     </w:p>
     <w:p/>
     <w:p>
       <w:r>
         <w:rPr>
-          <w:rFonts w:ascii="Calibri" w:hAnsi="Calibri"/>
           <w:b/>
           <w:sz w:val="24"/>
         </w:rPr>
-        <w:t>▶  Build It  (25 min)</w:t>
+        <w:t>▶  Values Brainstorm</w:t>
       </w:r>
     </w:p>
     <w:p>
       <w:r>
         <w:rPr>
-          <w:rFonts w:ascii="Calibri" w:hAnsi="Calibri"/>
-          <w:b w:val="0"/>
-          <w:color w:val="4EA8E6"/>
+          <w:color w:val="E91E8C"/>
           <w:sz w:val="20"/>
         </w:rPr>
-        <w:t>Tool: Padlet or Mentimeter</w:t>
+        <w:t>Tool: Mentimeter</w:t>
       </w:r>
     </w:p>
     <w:p>
       <w:r>
-        <w:rPr>
-          <w:rFonts w:ascii="Calibri" w:hAnsi="Calibri"/>
-          <w:b w:val="0"/>
-          <w:sz w:val="22"/>
-        </w:rPr>
-        <w:t>In pairs, design a 10-minute digital activity that embeds your sealed value. Use Padlet (collaborative board) or Mentimeter (polls/Q&amp;A). Your activity must: have clear instructions, be something a young person could actually do, and embed your value in a way that should be observable.</w:t>
+        <w:t>Submit your top 3 youth work values to a word cloud. What comes up most? What's surprising? What's missing that should be there?</w:t>
       </w:r>
     </w:p>
     <w:p/>
     <w:p>
       <w:r>
         <w:rPr>
-          <w:rFonts w:ascii="Calibri" w:hAnsi="Calibri"/>
           <w:b/>
           <w:sz w:val="24"/>
         </w:rPr>
-        <w:t>▶  Run It + Observe  (20 min)</w:t>
+        <w:t>▶  Rank Your Top 3</w:t>
       </w:r>
     </w:p>
     <w:p>
       <w:r>
         <w:rPr>
-          <w:rFonts w:ascii="Calibri" w:hAnsi="Calibri"/>
-          <w:b w:val="0"/>
-          <w:sz w:val="22"/>
+          <w:color w:val="E91E8C"/>
+          <w:sz w:val="20"/>
         </w:rPr>
-        <w:t>Swap with another pair. They run YOUR activity without your help. You sit back and watch. Observers: note down where you think their value shows up. What does the design tell you about what they believe?</w:t>
+        <w:t>Tool: Mentimeter</w:t>
+      </w:r>
+    </w:p>
+    <w:p>
+      <w:r>
+        <w:t>From the word cloud, pick YOUR top 3 values and rank them in a Mentimeter ranking poll. See how the room orders them. Discuss the biggest disagreements.</w:t>
       </w:r>
     </w:p>
     <w:p/>
     <w:p>
       <w:r>
         <w:rPr>
-          <w:rFonts w:ascii="Calibri" w:hAnsi="Calibri"/>
           <w:b/>
           <w:sz w:val="24"/>
         </w:rPr>
-        <w:t>▶  Envelope Reveal  (10 min)</w:t>
+        <w:t>▶  Story of a Value</w:t>
+      </w:r>
+    </w:p>
+    <w:p>
+      <w:r>
+        <w:t>Think of a moment when you saw a youth worker live out a value really well — with young people, not in a meeting. Tell your neighbour in 60 seconds. Swap. No-one presents back.</w:t>
+      </w:r>
+    </w:p>
+    <w:p/>
+    <w:p>
+      <w:r>
+        <w:rPr>
+          <w:b/>
+          <w:sz w:val="24"/>
+        </w:rPr>
+        <w:t>▶  Which Values Win Under Pressure?</w:t>
       </w:r>
     </w:p>
     <w:p>
       <w:r>
         <w:rPr>
-          <w:rFonts w:ascii="Calibri" w:hAnsi="Calibri"/>
-          <w:b w:val="0"/>
-          <w:sz w:val="22"/>
+          <w:color w:val="E91E8C"/>
+          <w:sz w:val="20"/>
         </w:rPr>
-        <w:t>Open the envelopes. Read the value out loud. Did the observers guess right? Where did the value show up? Where was it missing? Be honest — the gap is where the learning is.</w:t>
+        <w:t>Tool: Mentimeter</w:t>
+      </w:r>
+    </w:p>
+    <w:p>
+      <w:r>
+        <w:t>Vote: which value do you drop first when time is tight? When you're tired? When there's conflict? Show results. Be honest — the honest vote is the useful one.</w:t>
+      </w:r>
+    </w:p>
+    <w:p>
+      <w:r>
+        <w:rPr>
+          <w:b/>
+          <w:color w:val="7B61FF"/>
+        </w:rPr>
+        <w:t>Facilitator notes:</w:t>
+      </w:r>
+    </w:p>
+    <w:p>
+      <w:pPr>
+        <w:pStyle w:val="ListBullet"/>
+      </w:pPr>
+      <w:r>
+        <w:t>Use three separate Menti polls (single-choice) with the same value list</w:t>
+      </w:r>
+    </w:p>
+    <w:p>
+      <w:pPr>
+        <w:pStyle w:val="ListBullet"/>
+      </w:pPr>
+      <w:r>
+        <w:t>Don't comment on individual answers — let the pattern speak</w:t>
+      </w:r>
+    </w:p>
+    <w:p/>
+    <w:p>
+      <w:r>
+        <w:rPr>
+          <w:b/>
+          <w:sz w:val="24"/>
+        </w:rPr>
+        <w:t>▶  Values Drift</w:t>
+      </w:r>
+    </w:p>
+    <w:p>
+      <w:r>
+        <w:t>On a sticky note (private — no-one reads it aloud), write one value your organisation claims but you don't see in practice. Fold it. Add it to a pile on a table. Acknowledge the pile exists, then move on.</w:t>
       </w:r>
     </w:p>
     <w:p/>
@@ -592,7 +575,177 @@
       </w:pPr>
       <w:r>
         <w:rPr>
-          <w:color w:val="1A1A1A"/>
+          <w:color w:val="E91E8C"/>
+        </w:rPr>
+        <w:t>2. ACTIVITY (15 – 75 min)</w:t>
+      </w:r>
+    </w:p>
+    <w:p>
+      <w:r>
+        <w:rPr>
+          <w:b/>
+          <w:sz w:val="24"/>
+        </w:rPr>
+        <w:t>▶  Pick Your Value</w:t>
+      </w:r>
+    </w:p>
+    <w:p>
+      <w:r>
+        <w:t>Choose ONE value from the word cloud. Write it in your phone's notes app. Don't share it with anyone — this is the value you're going to deliberately embed in a digital activity.</w:t>
+      </w:r>
+    </w:p>
+    <w:p>
+      <w:r>
+        <w:rPr>
+          <w:b/>
+          <w:color w:val="7B61FF"/>
+        </w:rPr>
+        <w:t>Facilitator notes:</w:t>
+      </w:r>
+    </w:p>
+    <w:p>
+      <w:pPr>
+        <w:pStyle w:val="ListBullet"/>
+      </w:pPr>
+      <w:r>
+        <w:t>Encourage people to pick a value that feels slightly uncomfortable or contested — not the easy one</w:t>
+      </w:r>
+    </w:p>
+    <w:p/>
+    <w:p>
+      <w:r>
+        <w:rPr>
+          <w:b/>
+          <w:sz w:val="24"/>
+        </w:rPr>
+        <w:t>▶  Build It</w:t>
+      </w:r>
+    </w:p>
+    <w:p>
+      <w:r>
+        <w:rPr>
+          <w:color w:val="E91E8C"/>
+          <w:sz w:val="20"/>
+        </w:rPr>
+        <w:t>Tool: Padlet or Mentimeter</w:t>
+      </w:r>
+    </w:p>
+    <w:p>
+      <w:r>
+        <w:t>In pairs, design a 10-minute digital activity that embeds your value. Must have clear instructions, be something a young person could actually do, and embed the value in a way that should be visible from the outside.</w:t>
+      </w:r>
+    </w:p>
+    <w:p>
+      <w:r>
+        <w:rPr>
+          <w:b/>
+          <w:color w:val="7B61FF"/>
+        </w:rPr>
+        <w:t>Facilitator notes:</w:t>
+      </w:r>
+    </w:p>
+    <w:p>
+      <w:pPr>
+        <w:pStyle w:val="ListBullet"/>
+      </w:pPr>
+      <w:r>
+        <w:t>Have 4–5 blank Padlets / Menti templates ready so pairs aren't stuck in setup</w:t>
+      </w:r>
+    </w:p>
+    <w:p>
+      <w:pPr>
+        <w:pStyle w:val="ListBullet"/>
+      </w:pPr>
+      <w:r>
+        <w:t>Stop them at 20 mins regardless of readiness — rough is fine</w:t>
+      </w:r>
+    </w:p>
+    <w:p/>
+    <w:p>
+      <w:r>
+        <w:rPr>
+          <w:b/>
+          <w:sz w:val="24"/>
+        </w:rPr>
+        <w:t>▶  Run It / Observe</w:t>
+      </w:r>
+    </w:p>
+    <w:p>
+      <w:r>
+        <w:rPr>
+          <w:color w:val="E91E8C"/>
+          <w:sz w:val="20"/>
+        </w:rPr>
+        <w:t>Tool: Padlet or Mentimeter</w:t>
+      </w:r>
+    </w:p>
+    <w:p>
+      <w:r>
+        <w:t>Swap with another pair. They run YOUR activity without your help. You watch silently. Note: where does the value show up? What does the design tell you about what they believe?</w:t>
+      </w:r>
+    </w:p>
+    <w:p/>
+    <w:p>
+      <w:r>
+        <w:rPr>
+          <w:b/>
+          <w:sz w:val="24"/>
+        </w:rPr>
+        <w:t>▶  Predict the Value</w:t>
+      </w:r>
+    </w:p>
+    <w:p>
+      <w:r>
+        <w:rPr>
+          <w:color w:val="E91E8C"/>
+          <w:sz w:val="20"/>
+        </w:rPr>
+        <w:t>Tool: Mentimeter</w:t>
+      </w:r>
+    </w:p>
+    <w:p>
+      <w:r>
+        <w:t>Before the reveal, observers submit their guess in Mentimeter (open text): 'What value do you think this pair was trying to embed?' Submit first, then hear the answer.</w:t>
+      </w:r>
+    </w:p>
+    <w:p/>
+    <w:p>
+      <w:r>
+        <w:rPr>
+          <w:b/>
+          <w:sz w:val="24"/>
+        </w:rPr>
+        <w:t>▶  The Reveal</w:t>
+      </w:r>
+    </w:p>
+    <w:p>
+      <w:r>
+        <w:t>Each pair reads their value out loud. Compare with observer guesses. Did it land? Where was the gap? Be honest — the gap is where the learning is.</w:t>
+      </w:r>
+    </w:p>
+    <w:p/>
+    <w:p>
+      <w:r>
+        <w:rPr>
+          <w:b/>
+          <w:sz w:val="24"/>
+        </w:rPr>
+        <w:t>▶  The Value Gap</w:t>
+      </w:r>
+    </w:p>
+    <w:p>
+      <w:r>
+        <w:t>On the whiteboard, two columns: 'What I tried to embed' and 'What observers saw'. Everyone adds a sticky note to each column for their own activity. Walk the wall as a group.</w:t>
+      </w:r>
+    </w:p>
+    <w:p/>
+    <w:p>
+      <w:pPr>
+        <w:pStyle w:val="Heading2"/>
+      </w:pPr>
+      <w:r>
+        <w:rPr>
+          <w:color w:val="7B61FF"/>
         </w:rPr>
         <w:t>3. KEY IDEAS (75 – 95 min)</w:t>
       </w:r>
@@ -600,7 +753,6 @@
     <w:p>
       <w:r>
         <w:rPr>
-          <w:rFonts w:ascii="Calibri" w:hAnsi="Calibri"/>
           <w:b/>
           <w:sz w:val="24"/>
         </w:rPr>
@@ -609,12 +761,7 @@
     </w:p>
     <w:p>
       <w:r>
-        <w:rPr>
-          <w:rFonts w:ascii="Calibri" w:hAnsi="Calibri"/>
-          <w:b w:val="0"/>
-          <w:sz w:val="22"/>
-        </w:rPr>
-        <w:t>Keep this to 15-20 minutes. Use the slides. Key points:</w:t>
+        <w:t>Keep this to 15–20 minutes. Use the slides. Key points:</w:t>
       </w:r>
     </w:p>
     <w:p>
@@ -653,29 +800,30 @@
     <w:p>
       <w:r>
         <w:rPr>
-          <w:rFonts w:ascii="Calibri" w:hAnsi="Calibri"/>
           <w:b/>
           <w:sz w:val="24"/>
         </w:rPr>
-        <w:t>▶  Pressure Scenarios  (10 min)</w:t>
+        <w:t>▶  Pressure Scenarios</w:t>
       </w:r>
     </w:p>
     <w:p>
       <w:r>
         <w:rPr>
-          <w:rFonts w:ascii="Calibri" w:hAnsi="Calibri"/>
-          <w:b w:val="0"/>
-          <w:sz w:val="22"/>
+          <w:color w:val="E91E8C"/>
+          <w:sz w:val="20"/>
         </w:rPr>
-        <w:t>Facilitator reads 4 pressure scenarios. For each, participants write which of their top 3 values they'd sacrifice first.</w:t>
+        <w:t>Tool: Mentimeter</w:t>
+      </w:r>
+    </w:p>
+    <w:p>
+      <w:r>
+        <w:t>4 scenarios appear on screen one at a time. For each, vote live: which value would you sacrifice first? Show results. Where the room splits, that's the discussion.</w:t>
       </w:r>
     </w:p>
     <w:p>
       <w:r>
         <w:rPr>
-          <w:rFonts w:ascii="Calibri" w:hAnsi="Calibri"/>
           <w:b/>
-          <w:sz w:val="22"/>
         </w:rPr>
         <w:t>Examples:</w:t>
       </w:r>
@@ -714,87 +862,56 @@
     </w:p>
     <w:p/>
     <w:p>
-      <w:pPr>
-        <w:pStyle w:val="Heading2"/>
-      </w:pPr>
       <w:r>
         <w:rPr>
-          <w:color w:val="1A1A1A"/>
+          <w:b/>
+          <w:sz w:val="24"/>
         </w:rPr>
-        <w:t>4. DISCUSSION (95 – 150 min)</w:t>
+        <w:t>▶  Value Trade-Off Poll</w:t>
       </w:r>
     </w:p>
     <w:p>
       <w:r>
         <w:rPr>
-          <w:rFonts w:ascii="Calibri" w:hAnsi="Calibri"/>
-          <w:b/>
-          <w:sz w:val="24"/>
+          <w:color w:val="E91E8C"/>
+          <w:sz w:val="20"/>
         </w:rPr>
-        <w:t>▶  Value Trade-Off Cards  (20 min)</w:t>
+        <w:t>Tool: Mentimeter</w:t>
       </w:r>
     </w:p>
     <w:p>
       <w:r>
-        <w:rPr>
-          <w:rFonts w:ascii="Calibri" w:hAnsi="Calibri"/>
-          <w:b w:val="0"/>
-          <w:sz w:val="22"/>
-        </w:rPr>
-        <w:t>Each table gets a set of cards with value pairs that can conflict: Safety vs Freedom, Inclusion vs Efficiency, Fun vs Learning, Control vs Agency. Pick one pair. Design a scenario where you HAVE to choose. Present your dilemma to the group.</w:t>
+        <w:t>Four value pairs appear one at a time: Safety vs Freedom · Inclusion vs Efficiency · Fun vs Learning · Control vs Agency. For each, vote: which side do you prioritise? No middle option. Discuss the split.</w:t>
       </w:r>
     </w:p>
     <w:p/>
     <w:p>
       <w:r>
         <w:rPr>
-          <w:rFonts w:ascii="Calibri" w:hAnsi="Calibri"/>
           <w:b/>
           <w:sz w:val="24"/>
         </w:rPr>
-        <w:t>▶  Redesign Under Constraint  (20 min)</w:t>
+        <w:t>▶  Stated vs Shown</w:t>
       </w:r>
     </w:p>
     <w:p>
       <w:r>
-        <w:rPr>
-          <w:rFonts w:ascii="Calibri" w:hAnsi="Calibri"/>
-          <w:b w:val="0"/>
-          <w:color w:val="4EA8E6"/>
-          <w:sz w:val="20"/>
-        </w:rPr>
-        <w:t>Tool: Padlet</w:t>
-      </w:r>
-    </w:p>
-    <w:p>
-      <w:r>
-        <w:rPr>
-          <w:rFonts w:ascii="Calibri" w:hAnsi="Calibri"/>
-          <w:b w:val="0"/>
-          <w:sz w:val="22"/>
-        </w:rPr>
-        <w:t>Go back to your activity from earlier. Now add a constraint: half the group doesn't have smartphones / one participant has anxiety about being visible / you only have 5 minutes instead of 10. Redesign on Padlet. What did you have to change? What value did you have to compromise?</w:t>
+        <w:t>In pairs, look at your activity from earlier. Write on a sticky note: 'This activity states [value] but actually shows [value].' Not every activity matches its intent — that's the exercise.</w:t>
       </w:r>
     </w:p>
     <w:p/>
     <w:p>
       <w:r>
         <w:rPr>
-          <w:rFonts w:ascii="Calibri" w:hAnsi="Calibri"/>
           <w:b/>
           <w:sz w:val="24"/>
         </w:rPr>
-        <w:t>▶  Fishbowl Discussion  (15 min)</w:t>
+        <w:t>▶  The Brand vs The Behaviour</w:t>
       </w:r>
     </w:p>
     <w:p>
       <w:r>
-        <w:rPr>
-          <w:rFonts w:ascii="Calibri" w:hAnsi="Calibri"/>
-          <w:b w:val="0"/>
-          <w:sz w:val="22"/>
-        </w:rPr>
-        <w:t>4 chairs in the middle. Volunteers sit in them and discuss: 'When is it OK to compromise your values in youth work?' Everyone else listens. Anyone can tap in to replace a chair. Facilitator keeps time.</w:t>
+        <w:t>In groups of 3, name 3 well-known organisations (public examples, not your own) whose stated values contradict their practice. What's the gap? Why does it exist?</w:t>
       </w:r>
     </w:p>
     <w:p/>
@@ -804,7 +921,161 @@
       </w:pPr>
       <w:r>
         <w:rPr>
-          <w:color w:val="1A1A1A"/>
+          <w:color w:val="D19700"/>
+        </w:rPr>
+        <w:t>4. DISCUSSION (95 – 150 min)</w:t>
+      </w:r>
+    </w:p>
+    <w:p>
+      <w:r>
+        <w:rPr>
+          <w:b/>
+          <w:sz w:val="24"/>
+        </w:rPr>
+        <w:t>▶  Redesign Under Constraint</w:t>
+      </w:r>
+    </w:p>
+    <w:p>
+      <w:r>
+        <w:rPr>
+          <w:color w:val="E91E8C"/>
+          <w:sz w:val="20"/>
+        </w:rPr>
+        <w:t>Tool: Padlet</w:t>
+      </w:r>
+    </w:p>
+    <w:p>
+      <w:r>
+        <w:t>Go back to your activity. Add one constraint: half the group have no smartphone / one participant has anxiety about being visible / you only have 5 minutes. Redesign in Padlet. What did you drop? What value did you compromise?</w:t>
+      </w:r>
+    </w:p>
+    <w:p/>
+    <w:p>
+      <w:r>
+        <w:rPr>
+          <w:b/>
+          <w:sz w:val="24"/>
+        </w:rPr>
+        <w:t>▶  The Tool Dilemma</w:t>
+      </w:r>
+    </w:p>
+    <w:p>
+      <w:r>
+        <w:t>In pairs: name a platform you use with young people that you know compromises your values (Instagram, TikTok, WhatsApp, whatever). Why do you still use it? What's the trade-off you've accepted? Share back in one sentence.</w:t>
+      </w:r>
+    </w:p>
+    <w:p/>
+    <w:p>
+      <w:r>
+        <w:rPr>
+          <w:b/>
+          <w:sz w:val="24"/>
+        </w:rPr>
+        <w:t>▶  Fishbowl Discussion</w:t>
+      </w:r>
+    </w:p>
+    <w:p>
+      <w:r>
+        <w:t>4 chairs in the middle of the room. Volunteers sit and discuss: 'When is it OK to compromise your values in youth work?' Anyone can tap a shoulder to swap in. Everyone else listens in silence.</w:t>
+      </w:r>
+    </w:p>
+    <w:p>
+      <w:r>
+        <w:rPr>
+          <w:b/>
+          <w:color w:val="7B61FF"/>
+        </w:rPr>
+        <w:t>Facilitator notes:</w:t>
+      </w:r>
+    </w:p>
+    <w:p>
+      <w:pPr>
+        <w:pStyle w:val="ListBullet"/>
+      </w:pPr>
+      <w:r>
+        <w:t>Keep to 12 minutes — stop when the conversation naturally slows</w:t>
+      </w:r>
+    </w:p>
+    <w:p>
+      <w:pPr>
+        <w:pStyle w:val="ListBullet"/>
+      </w:pPr>
+      <w:r>
+        <w:t>If no-one swaps, the original 4 stay. That's fine.</w:t>
+      </w:r>
+    </w:p>
+    <w:p/>
+    <w:p>
+      <w:r>
+        <w:rPr>
+          <w:b/>
+          <w:sz w:val="24"/>
+        </w:rPr>
+        <w:t>▶  Principles Not Platforms</w:t>
+      </w:r>
+    </w:p>
+    <w:p>
+      <w:r>
+        <w:rPr>
+          <w:color w:val="E91E8C"/>
+          <w:sz w:val="20"/>
+        </w:rPr>
+        <w:t>Tool: Padlet</w:t>
+      </w:r>
+    </w:p>
+    <w:p>
+      <w:r>
+        <w:t>In groups of 3, write 5 principles that would guide your practice no matter what tool you use. Post each on a shared Padlet. Walk the Padlet as a group. Where do the principles overlap? Where do they disagree?</w:t>
+      </w:r>
+    </w:p>
+    <w:p/>
+    <w:p>
+      <w:r>
+        <w:rPr>
+          <w:b/>
+          <w:sz w:val="24"/>
+        </w:rPr>
+        <w:t>▶  Hot Seat</w:t>
+      </w:r>
+    </w:p>
+    <w:p>
+      <w:r>
+        <w:t>One volunteer claims a value out loud. Others ask questions for 3 minutes, challenging whether that value actually shows up in their practice. No gotchas — just genuine 'how does that actually work when…' questions.</w:t>
+      </w:r>
+    </w:p>
+    <w:p>
+      <w:r>
+        <w:rPr>
+          <w:b/>
+          <w:color w:val="7B61FF"/>
+        </w:rPr>
+        <w:t>Facilitator notes:</w:t>
+      </w:r>
+    </w:p>
+    <w:p>
+      <w:pPr>
+        <w:pStyle w:val="ListBullet"/>
+      </w:pPr>
+      <w:r>
+        <w:t>Only run this if the room is warm enough — otherwise skip</w:t>
+      </w:r>
+    </w:p>
+    <w:p>
+      <w:pPr>
+        <w:pStyle w:val="ListBullet"/>
+      </w:pPr>
+      <w:r>
+        <w:t>Time-box it strictly — 3 mins per volunteer</w:t>
+      </w:r>
+    </w:p>
+    <w:p/>
+    <w:p>
+      <w:pPr>
+        <w:pStyle w:val="Heading2"/>
+      </w:pPr>
+      <w:r>
+        <w:rPr>
+          <w:color w:val="00AA55"/>
         </w:rPr>
         <w:t>5. CLOSING (150 – 180 min)</w:t>
       </w:r>
@@ -812,9 +1083,7 @@
     <w:p>
       <w:r>
         <w:rPr>
-          <w:rFonts w:ascii="Calibri" w:hAnsi="Calibri"/>
           <w:b/>
-          <w:sz w:val="22"/>
         </w:rPr>
         <w:t>Closing Question:</w:t>
       </w:r>
@@ -822,9 +1091,8 @@
     <w:p>
       <w:r>
         <w:rPr>
-          <w:rFonts w:ascii="Calibri" w:hAnsi="Calibri"/>
-          <w:b/>
-          <w:color w:val="4EA8E6"/>
+          <w:i/>
+          <w:color w:val="00A6AD"/>
           <w:sz w:val="26"/>
         </w:rPr>
         <w:t>"If the platform disappeared tomorrow, what principles would still guide you?"</w:t>
@@ -833,20 +1101,11 @@
     <w:p>
       <w:r>
         <w:rPr>
-          <w:rFonts w:ascii="Calibri" w:hAnsi="Calibri"/>
           <w:b/>
-          <w:sz w:val="22"/>
         </w:rPr>
-        <w:t>What this means:</w:t>
+        <w:t xml:space="preserve">What this means: </w:t>
       </w:r>
-    </w:p>
-    <w:p>
       <w:r>
-        <w:rPr>
-          <w:rFonts w:ascii="Calibri" w:hAnsi="Calibri"/>
-          <w:b w:val="0"/>
-          <w:sz w:val="22"/>
-        </w:rPr>
         <w:t>Tools change. Apps shut down. But the way you think about young people's needs doesn't have to. The principle matters more than the platform.</w:t>
       </w:r>
     </w:p>
@@ -854,63 +1113,90 @@
     <w:p>
       <w:r>
         <w:rPr>
-          <w:rFonts w:ascii="Calibri" w:hAnsi="Calibri"/>
           <w:b/>
           <w:sz w:val="24"/>
         </w:rPr>
-        <w:t>▶  Principle Statement  (10 min)</w:t>
+        <w:t>▶  Principle Statement</w:t>
       </w:r>
     </w:p>
     <w:p>
       <w:r>
         <w:rPr>
-          <w:rFonts w:ascii="Calibri" w:hAnsi="Calibri"/>
-          <w:b w:val="0"/>
-          <w:sz w:val="22"/>
+          <w:color w:val="E91E8C"/>
+          <w:sz w:val="20"/>
         </w:rPr>
-        <w:t>Write one sentence: 'Regardless of what tool I use, I will always ___.' Share with the group. Pin them all on a board.</w:t>
+        <w:t>Tool: Mentimeter</w:t>
+      </w:r>
+    </w:p>
+    <w:p>
+      <w:r>
+        <w:t>Complete the sentence in Menti: 'Regardless of what tool I use, I will always ___.' Submit live. Show the wall. Read a few aloud.</w:t>
       </w:r>
     </w:p>
     <w:p/>
     <w:p>
       <w:r>
         <w:rPr>
-          <w:rFonts w:ascii="Calibri" w:hAnsi="Calibri"/>
           <w:b/>
           <w:sz w:val="24"/>
         </w:rPr>
-        <w:t>▶  Exit Ticket  (5 min)</w:t>
+        <w:t>▶  One Value I'm Watching</w:t>
       </w:r>
     </w:p>
     <w:p>
       <w:r>
-        <w:rPr>
-          <w:rFonts w:ascii="Calibri" w:hAnsi="Calibri"/>
-          <w:b w:val="0"/>
-          <w:sz w:val="22"/>
-        </w:rPr>
-        <w:t>Sticky note: One thing you learnt. One thing you'll change. One question you have.</w:t>
+        <w:t>On a sticky note: one value you're going to actively check yourself on this week. Stick it on the wall. Photograph the wall — it's your commitment.</w:t>
       </w:r>
     </w:p>
     <w:p/>
     <w:p>
       <w:r>
         <w:rPr>
-          <w:rFonts w:ascii="Calibri" w:hAnsi="Calibri"/>
           <w:b/>
-          <w:sz w:val="22"/>
+          <w:sz w:val="24"/>
         </w:rPr>
-        <w:t>Takeaway action:</w:t>
+        <w:t>▶  The Gap</w:t>
       </w:r>
     </w:p>
     <w:p>
       <w:r>
         <w:rPr>
-          <w:rFonts w:ascii="Calibri" w:hAnsi="Calibri"/>
-          <w:b w:val="0"/>
-          <w:sz w:val="22"/>
+          <w:color w:val="E91E8C"/>
+          <w:sz w:val="20"/>
         </w:rPr>
-        <w:t>Review one activity you currently run. What values does it express? What values are missing?</w:t>
+        <w:t>Tool: Mentimeter</w:t>
+      </w:r>
+    </w:p>
+    <w:p>
+      <w:r>
+        <w:t>Submit three things in Menti: one value I say I hold · one value I actually embody · one value I want to grow into. Read a few aloud.</w:t>
+      </w:r>
+    </w:p>
+    <w:p/>
+    <w:p>
+      <w:r>
+        <w:rPr>
+          <w:b/>
+          <w:sz w:val="24"/>
+        </w:rPr>
+        <w:t>▶  Exit Ticket</w:t>
+      </w:r>
+    </w:p>
+    <w:p>
+      <w:r>
+        <w:t>Sticky on the door frame as you leave: one word for how you feel about the value you chose today. Read them back at the start of Session 3.</w:t>
+      </w:r>
+    </w:p>
+    <w:p/>
+    <w:p>
+      <w:r>
+        <w:rPr>
+          <w:b/>
+        </w:rPr>
+        <w:t xml:space="preserve">Takeaway action: </w:t>
+      </w:r>
+      <w:r>
+        <w:t>Review one activity you currently run. What values does it actually embed? What values are missing?</w:t>
       </w:r>
     </w:p>
     <w:p/>
@@ -925,19 +1211,9 @@
       </w:pPr>
       <w:r>
         <w:rPr>
-          <w:color w:val="1A1A1A"/>
+          <w:color w:val="E91E8C"/>
         </w:rPr>
         <w:t>Setup Checklist</w:t>
-      </w:r>
-    </w:p>
-    <w:p>
-      <w:r>
-        <w:rPr>
-          <w:rFonts w:ascii="Calibri" w:hAnsi="Calibri"/>
-          <w:b/>
-          <w:sz w:val="22"/>
-        </w:rPr>
-        <w:t>Complete before the session:</w:t>
       </w:r>
     </w:p>
     <w:p>
@@ -977,7 +1253,7 @@
         <w:pStyle w:val="ListBullet"/>
       </w:pPr>
       <w:r>
-        <w:t>Print any templates, cards, or handouts needed</w:t>
+        <w:t>Print templates, cards, or handouts</w:t>
       </w:r>
     </w:p>
     <w:p>
@@ -985,7 +1261,7 @@
         <w:pStyle w:val="ListBullet"/>
       </w:pPr>
       <w:r>
-        <w:t>Have sticky notes and pens on every table</w:t>
+        <w:t>Sticky notes and pens on every table</w:t>
       </w:r>
     </w:p>
     <w:p>

</xml_diff>

<commit_message>
Session 2: add primer questions to Fishbowl Discussion
- 6 primers ranging from low-stakes to personal so fishbowl has somewhere to start
- Render 'examples' field on PPTX slides as PROMPTS (also fixes Pressure Scenarios)
- Facilitator note: project primers, drop a new one in only when conversation stalls

Co-Authored-By: Claude Opus 4.6 <noreply@anthropic.com>
</commit_message>
<xml_diff>
--- a/assets/downloads/Session-2-Your-Values-Under-Pressure-Facilitator-Guide.docx
+++ b/assets/downloads/Session-2-Your-Values-Under-Pressure-Facilitator-Guide.docx
@@ -976,7 +976,63 @@
     </w:p>
     <w:p>
       <w:r>
-        <w:t>4 chairs in the middle of the room. Volunteers sit and discuss: 'When is it OK to compromise your values in youth work?' Anyone can tap a shoulder to swap in. Everyone else listens in silence.</w:t>
+        <w:t>4 chairs in the middle of the room. Volunteers sit and discuss. Anyone can tap a shoulder to swap in. Everyone else listens in silence. Use the primers below to get going — pick whichever one hits hardest, or move through them as the conversation opens up.</w:t>
+      </w:r>
+    </w:p>
+    <w:p>
+      <w:r>
+        <w:rPr>
+          <w:b/>
+        </w:rPr>
+        <w:t>Examples:</w:t>
+      </w:r>
+    </w:p>
+    <w:p>
+      <w:pPr>
+        <w:pStyle w:val="ListBullet"/>
+      </w:pPr>
+      <w:r>
+        <w:t>When is it OK to compromise your values in youth work — and when isn't it?</w:t>
+      </w:r>
+    </w:p>
+    <w:p>
+      <w:pPr>
+        <w:pStyle w:val="ListBullet"/>
+      </w:pPr>
+      <w:r>
+        <w:t>Name a time you stayed silent when you should have spoken up. What stopped you?</w:t>
+      </w:r>
+    </w:p>
+    <w:p>
+      <w:pPr>
+        <w:pStyle w:val="ListBullet"/>
+      </w:pPr>
+      <w:r>
+        <w:t>Have you ever picked the tool that was easy over the tool that was right? What happened?</w:t>
+      </w:r>
+    </w:p>
+    <w:p>
+      <w:pPr>
+        <w:pStyle w:val="ListBullet"/>
+      </w:pPr>
+      <w:r>
+        <w:t>If a young person asked you 'do you actually believe this?' about something you're running — could you answer honestly?</w:t>
+      </w:r>
+    </w:p>
+    <w:p>
+      <w:pPr>
+        <w:pStyle w:val="ListBullet"/>
+      </w:pPr>
+      <w:r>
+        <w:t>What's a value your org says loudly that you've quietly stopped believing in?</w:t>
+      </w:r>
+    </w:p>
+    <w:p>
+      <w:pPr>
+        <w:pStyle w:val="ListBullet"/>
+      </w:pPr>
+      <w:r>
+        <w:t>When your values clash with your manager's, whose win — and why?</w:t>
       </w:r>
     </w:p>
     <w:p>
@@ -986,6 +1042,22 @@
           <w:color w:val="7B61FF"/>
         </w:rPr>
         <w:t>Facilitator notes:</w:t>
+      </w:r>
+    </w:p>
+    <w:p>
+      <w:pPr>
+        <w:pStyle w:val="ListBullet"/>
+      </w:pPr>
+      <w:r>
+        <w:t>Project the primers on screen so the fishbowl volunteers can glance up at them</w:t>
+      </w:r>
+    </w:p>
+    <w:p>
+      <w:pPr>
+        <w:pStyle w:val="ListBullet"/>
+      </w:pPr>
+      <w:r>
+        <w:t>Start with primer 1 or 2. Don't read all of them — drop a new one in only when the conversation stalls</w:t>
       </w:r>
     </w:p>
     <w:p>

</xml_diff>